<commit_message>
Duże zmiany, logika gry
</commit_message>
<xml_diff>
--- a/dokumentacja.docx
+++ b/dokumentacja.docx
@@ -88,7 +88,36 @@
     </w:p>
     <w:p>
       <w:r>
-        <w:t>3.06.2026</w:t>
+        <w:t>9.06.2026</w:t>
+      </w:r>
+    </w:p>
+    <w:p>
+      <w:r>
+        <w:t xml:space="preserve">Dodałem funkcję </w:t>
+      </w:r>
+      <w:proofErr w:type="spellStart"/>
+      <w:r>
+        <w:t>boardFull</w:t>
+      </w:r>
+      <w:proofErr w:type="spellEnd"/>
+      <w:r>
+        <w:t xml:space="preserve"> () ,której zadaniem jest sprawdzenie, czy wszystkie pola planszy są zajęte. Utworzyłem główną pętlę gry odpowiedzialną za przebieg rozgrywki (</w:t>
+      </w:r>
+      <w:proofErr w:type="spellStart"/>
+      <w:r>
+        <w:t>while</w:t>
+      </w:r>
+      <w:proofErr w:type="spellEnd"/>
+      <w:r>
+        <w:t>(</w:t>
+      </w:r>
+      <w:proofErr w:type="spellStart"/>
+      <w:r>
+        <w:t>true</w:t>
+      </w:r>
+      <w:proofErr w:type="spellEnd"/>
+      <w:r>
+        <w:t>)).  Dodałem wyświetlanie planszy przed każdym ruchem gracza. Zaimplementowałem pobieranie ruchu od użytkownika z klawiatury. Wprowadziłem możliwość umieszczenia symbolu X oraz 0 na planszy.  Dodałem sprawdzenie warunku zwycięstwa po każdym ruchu, oraz wykrywanie remisu po zapełnieniu całej planszy. Zakończona została implementacja podstawowej logiki gry dla dwóch graczy.</w:t>
       </w:r>
     </w:p>
     <w:sectPr>

</xml_diff>